<commit_message>
docs: remove AMEVA- prefix from titles and contents for project 2-8 in Word document
</commit_message>
<xml_diff>
--- a/combined_profile_summary_new.docx
+++ b/combined_profile_summary_new.docx
@@ -789,7 +789,7 @@
           <w:i w:val="0"/>
           <w:sz w:val="36"/>
         </w:rPr>
-        <w:t>2. AMEVA Agent Orchestra</w:t>
+        <w:t>2. Agent Orchestra</w:t>
       </w:r>
     </w:p>
     <w:p>
@@ -1194,7 +1194,7 @@
           <w:i w:val="0"/>
           <w:sz w:val="36"/>
         </w:rPr>
-        <w:t>3. AMEVA Dead Internet Theatre</w:t>
+        <w:t>3. Dead Internet Theatre</w:t>
       </w:r>
     </w:p>
     <w:p>
@@ -1651,7 +1651,7 @@
           <w:i w:val="0"/>
           <w:sz w:val="36"/>
         </w:rPr>
-        <w:t>4. AMEVA Benchmark Suite</w:t>
+        <w:t>4. Benchmark Suite</w:t>
       </w:r>
     </w:p>
     <w:p>
@@ -2171,7 +2171,7 @@
           <w:i w:val="0"/>
           <w:sz w:val="36"/>
         </w:rPr>
-        <w:t>5. AMEVA Doc AI</w:t>
+        <w:t>5. Doc AI</w:t>
       </w:r>
     </w:p>
     <w:p>
@@ -2772,7 +2772,7 @@
           <w:i w:val="0"/>
           <w:sz w:val="36"/>
         </w:rPr>
-        <w:t>6. AMEVA Edge Agent</w:t>
+        <w:t>6. Edge Agent</w:t>
       </w:r>
     </w:p>
     <w:p>
@@ -3533,7 +3533,7 @@
           <w:i w:val="0"/>
           <w:sz w:val="36"/>
         </w:rPr>
-        <w:t>7. AMEVA STT Agent</w:t>
+        <w:t>7. STT Agent</w:t>
       </w:r>
     </w:p>
     <w:p>
@@ -4296,7 +4296,7 @@
           <w:i w:val="0"/>
           <w:sz w:val="36"/>
         </w:rPr>
-        <w:t>8. AMEVA STT Trainer</w:t>
+        <w:t>8. STT Trainer</w:t>
       </w:r>
     </w:p>
     <w:p>

</xml_diff>